<commit_message>
Added mediation and downloadable report logic
</commit_message>
<xml_diff>
--- a/src/R/Modals/www/QA_report.docx
+++ b/src/R/Modals/www/QA_report.docx
@@ -7,31 +7,7 @@
         <w:pStyle w:val="Title"/>
       </w:pPr>
       <w:r>
-        <w:t xml:space="preserve">Data</w:t>
-      </w:r>
-      <w:r>
-        <w:t xml:space="preserve"> </w:t>
-      </w:r>
-      <w:r>
-        <w:t xml:space="preserve">quality</w:t>
-      </w:r>
-      <w:r>
-        <w:t xml:space="preserve"> </w:t>
-      </w:r>
-      <w:r>
-        <w:t xml:space="preserve">review</w:t>
-      </w:r>
-      <w:r>
-        <w:t xml:space="preserve"> </w:t>
-      </w:r>
-      <w:r>
-        <w:t xml:space="preserve">-</w:t>
-      </w:r>
-      <w:r>
-        <w:t xml:space="preserve"> </w:t>
-      </w:r>
-      <w:r>
-        <w:t xml:space="preserve">Belize</w:t>
+        <w:t xml:space="preserve">Revisión de calidad del dato - Belize</w:t>
       </w:r>
     </w:p>
     <w:p>
@@ -39,37 +15,7 @@
         <w:pStyle w:val="Author"/>
       </w:pPr>
       <w:r>
-        <w:t xml:space="preserve">Measles</w:t>
-      </w:r>
-      <w:r>
-        <w:t xml:space="preserve"> </w:t>
-      </w:r>
-      <w:r>
-        <w:t xml:space="preserve">and</w:t>
-      </w:r>
-      <w:r>
-        <w:t xml:space="preserve"> </w:t>
-      </w:r>
-      <w:r>
-        <w:t xml:space="preserve">Rubella</w:t>
-      </w:r>
-      <w:r>
-        <w:t xml:space="preserve"> </w:t>
-      </w:r>
-      <w:r>
-        <w:t xml:space="preserve">Risk</w:t>
-      </w:r>
-      <w:r>
-        <w:t xml:space="preserve"> </w:t>
-      </w:r>
-      <w:r>
-        <w:t xml:space="preserve">Assessment</w:t>
-      </w:r>
-      <w:r>
-        <w:t xml:space="preserve"> </w:t>
-      </w:r>
-      <w:r>
-        <w:t xml:space="preserve">Tool</w:t>
+        <w:t xml:space="preserve">Herramienta de evaluación del riesgo de sarampión y rubéola</w:t>
       </w:r>
     </w:p>
     <w:p>
@@ -77,7 +23,7 @@
         <w:pStyle w:val="Date"/>
       </w:pPr>
       <w:r>
-        <w:t xml:space="preserve">21.02.2025</w:t>
+        <w:t xml:space="preserve">29.05.2026</w:t>
       </w:r>
     </w:p>
     <w:p>
@@ -85,13 +31,13 @@
         <w:br w:type="page"/>
       </w:r>
     </w:p>
-    <w:bookmarkStart w:id="26" w:name="Xb119aa581dc399d58d33251aa685b91f27f1690"/>
+    <w:bookmarkStart w:id="15" w:name="X6c2ffd3f70a03f28246498dfeb31410e0ba1922"/>
     <w:p>
       <w:pPr>
         <w:pStyle w:val="Heading1"/>
       </w:pPr>
       <w:r>
-        <w:t xml:space="preserve">Quality review of geospatial vector data (shapefile)</w:t>
+        <w:t xml:space="preserve">Revisión de calidad de datos vectoriales geoespaciales (shapefiles)</w:t>
       </w:r>
     </w:p>
     <w:p>
@@ -103,18 +49,18 @@
           <wp:inline>
             <wp:extent cx="5334000" cy="4000500"/>
             <wp:effectExtent b="0" l="0" r="0" t="0"/>
-            <wp:docPr descr="" title="" id="21" name="Picture"/>
+            <wp:docPr descr="" title="" id="10" name="Picture"/>
             <a:graphic>
               <a:graphicData uri="http://schemas.openxmlformats.org/drawingml/2006/picture">
                 <pic:pic>
                   <pic:nvPicPr>
-                    <pic:cNvPr descr="figures/country_shapefiles.png" id="22" name="Picture"/>
+                    <pic:cNvPr descr="figures/country_shapefiles.png" id="11" name="Picture"/>
                     <pic:cNvPicPr>
                       <a:picLocks noChangeArrowheads="1" noChangeAspect="1"/>
                     </pic:cNvPicPr>
                   </pic:nvPicPr>
                   <pic:blipFill>
-                    <a:blip r:embed="rId20"/>
+                    <a:blip r:embed="rId9"/>
                     <a:stretch>
                       <a:fillRect/>
                     </a:stretch>
@@ -141,13 +87,13 @@
         </w:drawing>
       </w:r>
     </w:p>
-    <w:bookmarkStart w:id="23" w:name="problems-found"/>
+    <w:bookmarkStart w:id="12" w:name="problemas-encontrados"/>
     <w:p>
       <w:pPr>
         <w:pStyle w:val="Heading4"/>
       </w:pPr>
       <w:r>
-        <w:t xml:space="preserve">Problems found:</w:t>
+        <w:t xml:space="preserve">Problemas encontrados:</w:t>
       </w:r>
     </w:p>
     <w:p>
@@ -159,23 +105,23 @@
         </w:numPr>
       </w:pPr>
       <w:r>
-        <w:t xml:space="preserve">None.</w:t>
-      </w:r>
-    </w:p>
-    <w:bookmarkEnd w:id="23"/>
-    <w:bookmarkStart w:id="25" w:name="rows-with-missing-data."/>
+        <w:t xml:space="preserve">Ninguno.</w:t>
+      </w:r>
+    </w:p>
+    <w:bookmarkEnd w:id="12"/>
+    <w:bookmarkStart w:id="14" w:name="filas-con-datos-faltantes."/>
     <w:p>
       <w:pPr>
         <w:pStyle w:val="Heading4"/>
       </w:pPr>
       <w:r>
-        <w:t xml:space="preserve">Rows with missing data</w:t>
+        <w:t xml:space="preserve">Filas con datos faltantes</w:t>
       </w:r>
       <w:r>
         <w:rPr>
           <w:rStyle w:val="FootnoteReference"/>
         </w:rPr>
-        <w:footnoteReference w:id="24"/>
+        <w:footnoteReference w:id="13"/>
       </w:r>
       <w:r>
         <w:t xml:space="preserve">.</w:t>
@@ -202,7 +148,7 @@
               <w:jc w:val="left"/>
             </w:pPr>
             <w:r>
-              <w:t xml:space="preserve">No missing data found</w:t>
+              <w:t xml:space="preserve">No se encontraron datos faltantes</w:t>
             </w:r>
           </w:p>
         </w:tc>
@@ -223,18 +169,18 @@
         <w:br w:type="page"/>
       </w:r>
     </w:p>
-    <w:bookmarkEnd w:id="25"/>
-    <w:bookmarkEnd w:id="26"/>
-    <w:bookmarkStart w:id="69" w:name="review-of-country-data-quality"/>
+    <w:bookmarkEnd w:id="14"/>
+    <w:bookmarkEnd w:id="15"/>
+    <w:bookmarkStart w:id="58" w:name="revisión-de-calidad-de-datos-del-país"/>
     <w:p>
       <w:pPr>
         <w:pStyle w:val="Heading1"/>
       </w:pPr>
       <w:r>
-        <w:t xml:space="preserve">Review of country data quality</w:t>
-      </w:r>
-    </w:p>
-    <w:bookmarkStart w:id="28" w:name="general"/>
+        <w:t xml:space="preserve">Revisión de calidad de datos del país</w:t>
+      </w:r>
+    </w:p>
+    <w:bookmarkStart w:id="17" w:name="general"/>
     <w:p>
       <w:pPr>
         <w:pStyle w:val="Heading3"/>
@@ -243,13 +189,13 @@
         <w:t xml:space="preserve">1. General</w:t>
       </w:r>
     </w:p>
-    <w:bookmarkStart w:id="27" w:name="problems-found-1"/>
+    <w:bookmarkStart w:id="16" w:name="problemas-encontrados-1"/>
     <w:p>
       <w:pPr>
         <w:pStyle w:val="Heading4"/>
       </w:pPr>
       <w:r>
-        <w:t xml:space="preserve">Problems found:</w:t>
+        <w:t xml:space="preserve">Problemas encontrados:</w:t>
       </w:r>
     </w:p>
     <w:p>
@@ -261,7 +207,7 @@
         </w:numPr>
       </w:pPr>
       <w:r>
-        <w:t xml:space="preserve">None.</w:t>
+        <w:t xml:space="preserve">Ninguno.</w:t>
       </w:r>
     </w:p>
     <w:p>
@@ -269,24 +215,24 @@
         <w:br w:type="page"/>
       </w:r>
     </w:p>
-    <w:bookmarkEnd w:id="27"/>
-    <w:bookmarkEnd w:id="28"/>
-    <w:bookmarkStart w:id="35" w:name="population-and-area-data"/>
+    <w:bookmarkEnd w:id="16"/>
+    <w:bookmarkEnd w:id="17"/>
+    <w:bookmarkStart w:id="24" w:name="datos-de-población-y-área"/>
     <w:p>
       <w:pPr>
         <w:pStyle w:val="Heading3"/>
       </w:pPr>
       <w:r>
-        <w:t xml:space="preserve">2. Population and area data</w:t>
-      </w:r>
-    </w:p>
-    <w:bookmarkStart w:id="29" w:name="missing-data-by-variable."/>
+        <w:t xml:space="preserve">2. Datos de población y área</w:t>
+      </w:r>
+    </w:p>
+    <w:bookmarkStart w:id="18" w:name="datos-faltantes-por-variable."/>
     <w:p>
       <w:pPr>
         <w:pStyle w:val="Heading4"/>
       </w:pPr>
       <w:r>
-        <w:t xml:space="preserve">Missing data by variable.</w:t>
+        <w:t xml:space="preserve">Datos faltantes por variable.</w:t>
       </w:r>
     </w:p>
     <w:tbl>
@@ -324,7 +270,7 @@
               <w:jc w:val="right"/>
             </w:pPr>
             <w:r>
-              <w:t xml:space="preserve">Missing data</w:t>
+              <w:t xml:space="preserve">Datos faltantes</w:t>
             </w:r>
           </w:p>
         </w:tc>
@@ -362,7 +308,7 @@
               <w:jc w:val="right"/>
             </w:pPr>
             <w:r>
-              <w:t xml:space="preserve">Yes</w:t>
+              <w:t xml:space="preserve">No</w:t>
             </w:r>
           </w:p>
         </w:tc>
@@ -400,7 +346,7 @@
               <w:jc w:val="right"/>
             </w:pPr>
             <w:r>
-              <w:t xml:space="preserve">Yes</w:t>
+              <w:t xml:space="preserve">No</w:t>
             </w:r>
           </w:p>
         </w:tc>
@@ -438,7 +384,7 @@
               <w:jc w:val="right"/>
             </w:pPr>
             <w:r>
-              <w:t xml:space="preserve">Yes</w:t>
+              <w:t xml:space="preserve">No</w:t>
             </w:r>
           </w:p>
         </w:tc>
@@ -476,7 +422,7 @@
               <w:jc w:val="right"/>
             </w:pPr>
             <w:r>
-              <w:t xml:space="preserve">Yes</w:t>
+              <w:t xml:space="preserve">No</w:t>
             </w:r>
           </w:p>
         </w:tc>
@@ -514,7 +460,7 @@
               <w:jc w:val="right"/>
             </w:pPr>
             <w:r>
-              <w:t xml:space="preserve">Yes</w:t>
+              <w:t xml:space="preserve">No</w:t>
             </w:r>
           </w:p>
         </w:tc>
@@ -552,7 +498,7 @@
               <w:jc w:val="right"/>
             </w:pPr>
             <w:r>
-              <w:t xml:space="preserve">Yes</w:t>
+              <w:t xml:space="preserve">No</w:t>
             </w:r>
           </w:p>
         </w:tc>
@@ -570,20 +516,20 @@
         </w:tc>
       </w:tr>
     </w:tbl>
-    <w:bookmarkEnd w:id="29"/>
-    <w:bookmarkStart w:id="31" w:name="rows-with-missing-data.-1"/>
+    <w:bookmarkEnd w:id="18"/>
+    <w:bookmarkStart w:id="20" w:name="filas-con-datos-faltantes.-1"/>
     <w:p>
       <w:pPr>
         <w:pStyle w:val="Heading4"/>
       </w:pPr>
       <w:r>
-        <w:t xml:space="preserve">Rows with missing data</w:t>
+        <w:t xml:space="preserve">Filas con datos faltantes</w:t>
       </w:r>
       <w:r>
         <w:rPr>
           <w:rStyle w:val="FootnoteReference"/>
         </w:rPr>
-        <w:footnoteReference w:id="30"/>
+        <w:footnoteReference w:id="19"/>
       </w:r>
       <w:r>
         <w:t xml:space="preserve">.</w:t>
@@ -610,7 +556,7 @@
               <w:jc w:val="left"/>
             </w:pPr>
             <w:r>
-              <w:t xml:space="preserve">No missing data found</w:t>
+              <w:t xml:space="preserve">No se encontraron datos faltantes</w:t>
             </w:r>
           </w:p>
         </w:tc>
@@ -626,14 +572,14 @@
         </w:tc>
       </w:tr>
     </w:tbl>
-    <w:bookmarkEnd w:id="31"/>
-    <w:bookmarkStart w:id="32" w:name="data-with-invalid-geocodes."/>
+    <w:bookmarkEnd w:id="20"/>
+    <w:bookmarkStart w:id="21" w:name="datos-con-geocódigos-inválidos."/>
     <w:p>
       <w:pPr>
         <w:pStyle w:val="Heading4"/>
       </w:pPr>
       <w:r>
-        <w:t xml:space="preserve">Data with invalid geocodes.</w:t>
+        <w:t xml:space="preserve">Datos con geocódigos inválidos.</w:t>
       </w:r>
     </w:p>
     <w:tbl>
@@ -657,7 +603,7 @@
               <w:jc w:val="left"/>
             </w:pPr>
             <w:r>
-              <w:t xml:space="preserve">No invalid geocodes found</w:t>
+              <w:t xml:space="preserve">No se encontraron geocódigos inválidos</w:t>
             </w:r>
           </w:p>
         </w:tc>
@@ -673,26 +619,20 @@
         </w:tc>
       </w:tr>
     </w:tbl>
-    <w:bookmarkEnd w:id="32"/>
-    <w:bookmarkStart w:id="33" w:name="non-numeric-data-in-población-total."/>
+    <w:bookmarkEnd w:id="21"/>
+    <w:bookmarkStart w:id="22" w:name="datos-no-numéricos-en-población-total."/>
     <w:p>
       <w:pPr>
         <w:pStyle w:val="Heading4"/>
       </w:pPr>
       <w:r>
-        <w:t xml:space="preserve">Non-numeric data in</w:t>
+        <w:t xml:space="preserve">Datos no numéricos en</w:t>
       </w:r>
       <w:r>
         <w:t xml:space="preserve"> </w:t>
       </w:r>
       <w:r>
-        <w:t xml:space="preserve">‘</w:t>
-      </w:r>
-      <w:r>
-        <w:t xml:space="preserve">Población total</w:t>
-      </w:r>
-      <w:r>
-        <w:t xml:space="preserve">’</w:t>
+        <w:t xml:space="preserve">‘Población total’</w:t>
       </w:r>
       <w:r>
         <w:t xml:space="preserve">.</w:t>
@@ -719,7 +659,7 @@
               <w:jc w:val="left"/>
             </w:pPr>
             <w:r>
-              <w:t xml:space="preserve">No non-numeric data found</w:t>
+              <w:t xml:space="preserve">No se encontraron datos no numéricos</w:t>
             </w:r>
           </w:p>
         </w:tc>
@@ -735,26 +675,20 @@
         </w:tc>
       </w:tr>
     </w:tbl>
-    <w:bookmarkEnd w:id="33"/>
-    <w:bookmarkStart w:id="34" w:name="X4d5c93dbafeeed692b77b1ebfcd037b0f5bec5f"/>
+    <w:bookmarkEnd w:id="22"/>
+    <w:bookmarkStart w:id="23" w:name="X961a01fbf9656b84af79fbdd881f368e0d232f5"/>
     <w:p>
       <w:pPr>
         <w:pStyle w:val="Heading4"/>
       </w:pPr>
       <w:r>
-        <w:t xml:space="preserve">Non-numeric data in</w:t>
+        <w:t xml:space="preserve">Datos no numéricos en</w:t>
       </w:r>
       <w:r>
         <w:t xml:space="preserve"> </w:t>
       </w:r>
       <w:r>
-        <w:t xml:space="preserve">‘</w:t>
-      </w:r>
-      <w:r>
-        <w:t xml:space="preserve">Area (km2) del municipio</w:t>
-      </w:r>
-      <w:r>
-        <w:t xml:space="preserve">’</w:t>
+        <w:t xml:space="preserve">‘Area (km2) del municipio’</w:t>
       </w:r>
       <w:r>
         <w:t xml:space="preserve">.</w:t>
@@ -781,7 +715,7 @@
               <w:jc w:val="left"/>
             </w:pPr>
             <w:r>
-              <w:t xml:space="preserve">No non-numeric data found</w:t>
+              <w:t xml:space="preserve">No se encontraron datos no numéricos</w:t>
             </w:r>
           </w:p>
         </w:tc>
@@ -802,24 +736,24 @@
         <w:br w:type="page"/>
       </w:r>
     </w:p>
-    <w:bookmarkEnd w:id="34"/>
-    <w:bookmarkEnd w:id="35"/>
-    <w:bookmarkStart w:id="42" w:name="population-immunity"/>
+    <w:bookmarkEnd w:id="23"/>
+    <w:bookmarkEnd w:id="24"/>
+    <w:bookmarkStart w:id="31" w:name="inmunidad-poblacional"/>
     <w:p>
       <w:pPr>
         <w:pStyle w:val="Heading3"/>
       </w:pPr>
       <w:r>
-        <w:t xml:space="preserve">3. Population immunity</w:t>
-      </w:r>
-    </w:p>
-    <w:bookmarkStart w:id="36" w:name="missing-data-by-variable.-1"/>
+        <w:t xml:space="preserve">3. Inmunidad poblacional</w:t>
+      </w:r>
+    </w:p>
+    <w:bookmarkStart w:id="25" w:name="datos-faltantes-por-variable.-1"/>
     <w:p>
       <w:pPr>
         <w:pStyle w:val="Heading4"/>
       </w:pPr>
       <w:r>
-        <w:t xml:space="preserve">Missing data by variable.</w:t>
+        <w:t xml:space="preserve">Datos faltantes por variable.</w:t>
       </w:r>
     </w:p>
     <w:tbl>
@@ -857,7 +791,7 @@
               <w:jc w:val="right"/>
             </w:pPr>
             <w:r>
-              <w:t xml:space="preserve">Missing data</w:t>
+              <w:t xml:space="preserve">Datos faltantes</w:t>
             </w:r>
           </w:p>
         </w:tc>
@@ -895,7 +829,7 @@
               <w:jc w:val="right"/>
             </w:pPr>
             <w:r>
-              <w:t xml:space="preserve">Yes</w:t>
+              <w:t xml:space="preserve">No</w:t>
             </w:r>
           </w:p>
         </w:tc>
@@ -933,7 +867,7 @@
               <w:jc w:val="right"/>
             </w:pPr>
             <w:r>
-              <w:t xml:space="preserve">Yes</w:t>
+              <w:t xml:space="preserve">No</w:t>
             </w:r>
           </w:p>
         </w:tc>
@@ -971,7 +905,7 @@
               <w:jc w:val="right"/>
             </w:pPr>
             <w:r>
-              <w:t xml:space="preserve">Yes</w:t>
+              <w:t xml:space="preserve">No</w:t>
             </w:r>
           </w:p>
         </w:tc>
@@ -1009,7 +943,7 @@
               <w:jc w:val="right"/>
             </w:pPr>
             <w:r>
-              <w:t xml:space="preserve">Yes</w:t>
+              <w:t xml:space="preserve">No</w:t>
             </w:r>
           </w:p>
         </w:tc>
@@ -1035,19 +969,19 @@
               <w:jc w:val="left"/>
             </w:pPr>
             <w:r>
-              <w:t xml:space="preserve">MMR1 2019</w:t>
-            </w:r>
-          </w:p>
-        </w:tc>
-        <w:tc>
-          <w:tcPr/>
-          <w:p>
-            <w:pPr>
-              <w:pStyle w:val="Compact"/>
-              <w:jc w:val="right"/>
-            </w:pPr>
-            <w:r>
-              <w:t xml:space="preserve">Yes</w:t>
+              <w:t xml:space="preserve">SRP1 2019</w:t>
+            </w:r>
+          </w:p>
+        </w:tc>
+        <w:tc>
+          <w:tcPr/>
+          <w:p>
+            <w:pPr>
+              <w:pStyle w:val="Compact"/>
+              <w:jc w:val="right"/>
+            </w:pPr>
+            <w:r>
+              <w:t xml:space="preserve">No</w:t>
             </w:r>
           </w:p>
         </w:tc>
@@ -1073,19 +1007,19 @@
               <w:jc w:val="left"/>
             </w:pPr>
             <w:r>
-              <w:t xml:space="preserve">MMR1 2020</w:t>
-            </w:r>
-          </w:p>
-        </w:tc>
-        <w:tc>
-          <w:tcPr/>
-          <w:p>
-            <w:pPr>
-              <w:pStyle w:val="Compact"/>
-              <w:jc w:val="right"/>
-            </w:pPr>
-            <w:r>
-              <w:t xml:space="preserve">Yes</w:t>
+              <w:t xml:space="preserve">SRP1 2020</w:t>
+            </w:r>
+          </w:p>
+        </w:tc>
+        <w:tc>
+          <w:tcPr/>
+          <w:p>
+            <w:pPr>
+              <w:pStyle w:val="Compact"/>
+              <w:jc w:val="right"/>
+            </w:pPr>
+            <w:r>
+              <w:t xml:space="preserve">No</w:t>
             </w:r>
           </w:p>
         </w:tc>
@@ -1111,19 +1045,19 @@
               <w:jc w:val="left"/>
             </w:pPr>
             <w:r>
-              <w:t xml:space="preserve">MMR1 2021</w:t>
-            </w:r>
-          </w:p>
-        </w:tc>
-        <w:tc>
-          <w:tcPr/>
-          <w:p>
-            <w:pPr>
-              <w:pStyle w:val="Compact"/>
-              <w:jc w:val="right"/>
-            </w:pPr>
-            <w:r>
-              <w:t xml:space="preserve">Yes</w:t>
+              <w:t xml:space="preserve">SRP1 2021</w:t>
+            </w:r>
+          </w:p>
+        </w:tc>
+        <w:tc>
+          <w:tcPr/>
+          <w:p>
+            <w:pPr>
+              <w:pStyle w:val="Compact"/>
+              <w:jc w:val="right"/>
+            </w:pPr>
+            <w:r>
+              <w:t xml:space="preserve">No</w:t>
             </w:r>
           </w:p>
         </w:tc>
@@ -1149,19 +1083,19 @@
               <w:jc w:val="left"/>
             </w:pPr>
             <w:r>
-              <w:t xml:space="preserve">MMR1 2022</w:t>
-            </w:r>
-          </w:p>
-        </w:tc>
-        <w:tc>
-          <w:tcPr/>
-          <w:p>
-            <w:pPr>
-              <w:pStyle w:val="Compact"/>
-              <w:jc w:val="right"/>
-            </w:pPr>
-            <w:r>
-              <w:t xml:space="preserve">Yes</w:t>
+              <w:t xml:space="preserve">SRP1 2022</w:t>
+            </w:r>
+          </w:p>
+        </w:tc>
+        <w:tc>
+          <w:tcPr/>
+          <w:p>
+            <w:pPr>
+              <w:pStyle w:val="Compact"/>
+              <w:jc w:val="right"/>
+            </w:pPr>
+            <w:r>
+              <w:t xml:space="preserve">No</w:t>
             </w:r>
           </w:p>
         </w:tc>
@@ -1187,19 +1121,19 @@
               <w:jc w:val="left"/>
             </w:pPr>
             <w:r>
-              <w:t xml:space="preserve">MMR1 2023</w:t>
-            </w:r>
-          </w:p>
-        </w:tc>
-        <w:tc>
-          <w:tcPr/>
-          <w:p>
-            <w:pPr>
-              <w:pStyle w:val="Compact"/>
-              <w:jc w:val="right"/>
-            </w:pPr>
-            <w:r>
-              <w:t xml:space="preserve">Yes</w:t>
+              <w:t xml:space="preserve">SRP1 2023</w:t>
+            </w:r>
+          </w:p>
+        </w:tc>
+        <w:tc>
+          <w:tcPr/>
+          <w:p>
+            <w:pPr>
+              <w:pStyle w:val="Compact"/>
+              <w:jc w:val="right"/>
+            </w:pPr>
+            <w:r>
+              <w:t xml:space="preserve">No</w:t>
             </w:r>
           </w:p>
         </w:tc>
@@ -1225,19 +1159,19 @@
               <w:jc w:val="left"/>
             </w:pPr>
             <w:r>
-              <w:t xml:space="preserve">MMR2 2019</w:t>
-            </w:r>
-          </w:p>
-        </w:tc>
-        <w:tc>
-          <w:tcPr/>
-          <w:p>
-            <w:pPr>
-              <w:pStyle w:val="Compact"/>
-              <w:jc w:val="right"/>
-            </w:pPr>
-            <w:r>
-              <w:t xml:space="preserve">Yes</w:t>
+              <w:t xml:space="preserve">SRP2 2019</w:t>
+            </w:r>
+          </w:p>
+        </w:tc>
+        <w:tc>
+          <w:tcPr/>
+          <w:p>
+            <w:pPr>
+              <w:pStyle w:val="Compact"/>
+              <w:jc w:val="right"/>
+            </w:pPr>
+            <w:r>
+              <w:t xml:space="preserve">No</w:t>
             </w:r>
           </w:p>
         </w:tc>
@@ -1263,19 +1197,19 @@
               <w:jc w:val="left"/>
             </w:pPr>
             <w:r>
-              <w:t xml:space="preserve">MMR2 2020</w:t>
-            </w:r>
-          </w:p>
-        </w:tc>
-        <w:tc>
-          <w:tcPr/>
-          <w:p>
-            <w:pPr>
-              <w:pStyle w:val="Compact"/>
-              <w:jc w:val="right"/>
-            </w:pPr>
-            <w:r>
-              <w:t xml:space="preserve">Yes</w:t>
+              <w:t xml:space="preserve">SRP2 2020</w:t>
+            </w:r>
+          </w:p>
+        </w:tc>
+        <w:tc>
+          <w:tcPr/>
+          <w:p>
+            <w:pPr>
+              <w:pStyle w:val="Compact"/>
+              <w:jc w:val="right"/>
+            </w:pPr>
+            <w:r>
+              <w:t xml:space="preserve">No</w:t>
             </w:r>
           </w:p>
         </w:tc>
@@ -1301,19 +1235,19 @@
               <w:jc w:val="left"/>
             </w:pPr>
             <w:r>
-              <w:t xml:space="preserve">MMR2 2021</w:t>
-            </w:r>
-          </w:p>
-        </w:tc>
-        <w:tc>
-          <w:tcPr/>
-          <w:p>
-            <w:pPr>
-              <w:pStyle w:val="Compact"/>
-              <w:jc w:val="right"/>
-            </w:pPr>
-            <w:r>
-              <w:t xml:space="preserve">Yes</w:t>
+              <w:t xml:space="preserve">SRP2 2021</w:t>
+            </w:r>
+          </w:p>
+        </w:tc>
+        <w:tc>
+          <w:tcPr/>
+          <w:p>
+            <w:pPr>
+              <w:pStyle w:val="Compact"/>
+              <w:jc w:val="right"/>
+            </w:pPr>
+            <w:r>
+              <w:t xml:space="preserve">No</w:t>
             </w:r>
           </w:p>
         </w:tc>
@@ -1339,19 +1273,19 @@
               <w:jc w:val="left"/>
             </w:pPr>
             <w:r>
-              <w:t xml:space="preserve">MMR2 2022</w:t>
-            </w:r>
-          </w:p>
-        </w:tc>
-        <w:tc>
-          <w:tcPr/>
-          <w:p>
-            <w:pPr>
-              <w:pStyle w:val="Compact"/>
-              <w:jc w:val="right"/>
-            </w:pPr>
-            <w:r>
-              <w:t xml:space="preserve">Yes</w:t>
+              <w:t xml:space="preserve">SRP2 2022</w:t>
+            </w:r>
+          </w:p>
+        </w:tc>
+        <w:tc>
+          <w:tcPr/>
+          <w:p>
+            <w:pPr>
+              <w:pStyle w:val="Compact"/>
+              <w:jc w:val="right"/>
+            </w:pPr>
+            <w:r>
+              <w:t xml:space="preserve">No</w:t>
             </w:r>
           </w:p>
         </w:tc>
@@ -1377,19 +1311,19 @@
               <w:jc w:val="left"/>
             </w:pPr>
             <w:r>
-              <w:t xml:space="preserve">MMR2 2023</w:t>
-            </w:r>
-          </w:p>
-        </w:tc>
-        <w:tc>
-          <w:tcPr/>
-          <w:p>
-            <w:pPr>
-              <w:pStyle w:val="Compact"/>
-              <w:jc w:val="right"/>
-            </w:pPr>
-            <w:r>
-              <w:t xml:space="preserve">Yes</w:t>
+              <w:t xml:space="preserve">SRP2 2023</w:t>
+            </w:r>
+          </w:p>
+        </w:tc>
+        <w:tc>
+          <w:tcPr/>
+          <w:p>
+            <w:pPr>
+              <w:pStyle w:val="Compact"/>
+              <w:jc w:val="right"/>
+            </w:pPr>
+            <w:r>
+              <w:t xml:space="preserve">No</w:t>
             </w:r>
           </w:p>
         </w:tc>
@@ -1415,19 +1349,19 @@
               <w:jc w:val="left"/>
             </w:pPr>
             <w:r>
-              <w:t xml:space="preserve">Coverage of latest follow-up campaign</w:t>
-            </w:r>
-          </w:p>
-        </w:tc>
-        <w:tc>
-          <w:tcPr/>
-          <w:p>
-            <w:pPr>
-              <w:pStyle w:val="Compact"/>
-              <w:jc w:val="right"/>
-            </w:pPr>
-            <w:r>
-              <w:t xml:space="preserve">Yes</w:t>
+              <w:t xml:space="preserve">Cobertura de la última campaña de seguimiento</w:t>
+            </w:r>
+          </w:p>
+        </w:tc>
+        <w:tc>
+          <w:tcPr/>
+          <w:p>
+            <w:pPr>
+              <w:pStyle w:val="Compact"/>
+              <w:jc w:val="right"/>
+            </w:pPr>
+            <w:r>
+              <w:t xml:space="preserve">No</w:t>
             </w:r>
           </w:p>
         </w:tc>
@@ -1445,20 +1379,20 @@
         </w:tc>
       </w:tr>
     </w:tbl>
-    <w:bookmarkEnd w:id="36"/>
-    <w:bookmarkStart w:id="38" w:name="missing-identifier-data."/>
+    <w:bookmarkEnd w:id="25"/>
+    <w:bookmarkStart w:id="27" w:name="datos-identificadores-faltantes."/>
     <w:p>
       <w:pPr>
         <w:pStyle w:val="Heading4"/>
       </w:pPr>
       <w:r>
-        <w:t xml:space="preserve">Missing identifier data</w:t>
+        <w:t xml:space="preserve">Datos identificadores faltantes</w:t>
       </w:r>
       <w:r>
         <w:rPr>
           <w:rStyle w:val="FootnoteReference"/>
         </w:rPr>
-        <w:footnoteReference w:id="37"/>
+        <w:footnoteReference w:id="26"/>
       </w:r>
       <w:r>
         <w:t xml:space="preserve">.</w:t>
@@ -1485,7 +1419,7 @@
               <w:jc w:val="left"/>
             </w:pPr>
             <w:r>
-              <w:t xml:space="preserve">No missing data found</w:t>
+              <w:t xml:space="preserve">No se encontraron datos faltantes</w:t>
             </w:r>
           </w:p>
         </w:tc>
@@ -1501,14 +1435,14 @@
         </w:tc>
       </w:tr>
     </w:tbl>
-    <w:bookmarkEnd w:id="38"/>
-    <w:bookmarkStart w:id="39" w:name="data-with-invalid-geocodes.-1"/>
+    <w:bookmarkEnd w:id="27"/>
+    <w:bookmarkStart w:id="28" w:name="datos-con-geocódigos-inválidos.-1"/>
     <w:p>
       <w:pPr>
         <w:pStyle w:val="Heading4"/>
       </w:pPr>
       <w:r>
-        <w:t xml:space="preserve">Data with invalid geocodes.</w:t>
+        <w:t xml:space="preserve">Datos con geocódigos inválidos.</w:t>
       </w:r>
     </w:p>
     <w:tbl>
@@ -1532,7 +1466,7 @@
               <w:jc w:val="left"/>
             </w:pPr>
             <w:r>
-              <w:t xml:space="preserve">No invalid geocodes found</w:t>
+              <w:t xml:space="preserve">No se encontraron geocódigos inválidos</w:t>
             </w:r>
           </w:p>
         </w:tc>
@@ -1548,14 +1482,14 @@
         </w:tc>
       </w:tr>
     </w:tbl>
-    <w:bookmarkEnd w:id="39"/>
-    <w:bookmarkStart w:id="40" w:name="X878353f2c2bd9584fbc69c178dfa636ce05ac24"/>
+    <w:bookmarkEnd w:id="28"/>
+    <w:bookmarkStart w:id="29" w:name="X1466cdcc7d2ad893ef08e58c3573556b681ec44"/>
     <w:p>
       <w:pPr>
         <w:pStyle w:val="Heading4"/>
       </w:pPr>
       <w:r>
-        <w:t xml:space="preserve">No non-numeric or missing data found (MMR1)</w:t>
+        <w:t xml:space="preserve">No se encontraron datos no numéricos o faltantes (SRP1)</w:t>
       </w:r>
     </w:p>
     <w:tbl>
@@ -1579,7 +1513,7 @@
               <w:jc w:val="left"/>
             </w:pPr>
             <w:r>
-              <w:t xml:space="preserve">No non-numeric or missing data found</w:t>
+              <w:t xml:space="preserve">No se encontraron datos no numéricos o faltantes</w:t>
             </w:r>
           </w:p>
         </w:tc>
@@ -1595,14 +1529,14 @@
         </w:tc>
       </w:tr>
     </w:tbl>
-    <w:bookmarkEnd w:id="40"/>
-    <w:bookmarkStart w:id="41" w:name="Xa53ccefc127edb0d2211747b5c9c81d868f2508"/>
+    <w:bookmarkEnd w:id="29"/>
+    <w:bookmarkStart w:id="30" w:name="X98b48dd46d803f6da30f31f77414f202e86b745"/>
     <w:p>
       <w:pPr>
         <w:pStyle w:val="Heading4"/>
       </w:pPr>
       <w:r>
-        <w:t xml:space="preserve">No non-numeric or missing data found (MMR2, Coverage of latest follow-up campaign)</w:t>
+        <w:t xml:space="preserve">No se encontraron datos no numéricos o faltantes (SRP2, Cobertura de la última campaña de seguimiento)</w:t>
       </w:r>
     </w:p>
     <w:tbl>
@@ -1626,7 +1560,7 @@
               <w:jc w:val="left"/>
             </w:pPr>
             <w:r>
-              <w:t xml:space="preserve">No non-numeric or missing data found</w:t>
+              <w:t xml:space="preserve">No se encontraron datos no numéricos o faltantes</w:t>
             </w:r>
           </w:p>
         </w:tc>
@@ -1647,24 +1581,24 @@
         <w:br w:type="page"/>
       </w:r>
     </w:p>
-    <w:bookmarkEnd w:id="41"/>
-    <w:bookmarkEnd w:id="42"/>
-    <w:bookmarkStart w:id="48" w:name="program-delivery-performance"/>
+    <w:bookmarkEnd w:id="30"/>
+    <w:bookmarkEnd w:id="31"/>
+    <w:bookmarkStart w:id="37" w:name="desempeño-del-programa"/>
     <w:p>
       <w:pPr>
         <w:pStyle w:val="Heading3"/>
       </w:pPr>
       <w:r>
-        <w:t xml:space="preserve">4. Program delivery performance</w:t>
-      </w:r>
-    </w:p>
-    <w:bookmarkStart w:id="43" w:name="missing-data-by-variable.-2"/>
+        <w:t xml:space="preserve">4. Desempeño del programa</w:t>
+      </w:r>
+    </w:p>
+    <w:bookmarkStart w:id="32" w:name="datos-faltantes-por-variable.-2"/>
     <w:p>
       <w:pPr>
         <w:pStyle w:val="Heading4"/>
       </w:pPr>
       <w:r>
-        <w:t xml:space="preserve">Missing data by variable.</w:t>
+        <w:t xml:space="preserve">Datos faltantes por variable.</w:t>
       </w:r>
     </w:p>
     <w:tbl>
@@ -1702,7 +1636,7 @@
               <w:jc w:val="right"/>
             </w:pPr>
             <w:r>
-              <w:t xml:space="preserve">Missing data</w:t>
+              <w:t xml:space="preserve">Datos faltantes</w:t>
             </w:r>
           </w:p>
         </w:tc>
@@ -1740,7 +1674,7 @@
               <w:jc w:val="right"/>
             </w:pPr>
             <w:r>
-              <w:t xml:space="preserve">Yes</w:t>
+              <w:t xml:space="preserve">No</w:t>
             </w:r>
           </w:p>
         </w:tc>
@@ -1778,7 +1712,7 @@
               <w:jc w:val="right"/>
             </w:pPr>
             <w:r>
-              <w:t xml:space="preserve">Yes</w:t>
+              <w:t xml:space="preserve">No</w:t>
             </w:r>
           </w:p>
         </w:tc>
@@ -1816,7 +1750,7 @@
               <w:jc w:val="right"/>
             </w:pPr>
             <w:r>
-              <w:t xml:space="preserve">Yes</w:t>
+              <w:t xml:space="preserve">No</w:t>
             </w:r>
           </w:p>
         </w:tc>
@@ -1854,7 +1788,7 @@
               <w:jc w:val="right"/>
             </w:pPr>
             <w:r>
-              <w:t xml:space="preserve">Yes</w:t>
+              <w:t xml:space="preserve">No</w:t>
             </w:r>
           </w:p>
         </w:tc>
@@ -1892,7 +1826,7 @@
               <w:jc w:val="right"/>
             </w:pPr>
             <w:r>
-              <w:t xml:space="preserve">Yes</w:t>
+              <w:t xml:space="preserve">No</w:t>
             </w:r>
           </w:p>
         </w:tc>
@@ -1930,7 +1864,7 @@
               <w:jc w:val="right"/>
             </w:pPr>
             <w:r>
-              <w:t xml:space="preserve">Yes</w:t>
+              <w:t xml:space="preserve">No</w:t>
             </w:r>
           </w:p>
         </w:tc>
@@ -1968,7 +1902,7 @@
               <w:jc w:val="right"/>
             </w:pPr>
             <w:r>
-              <w:t xml:space="preserve">Yes</w:t>
+              <w:t xml:space="preserve">No</w:t>
             </w:r>
           </w:p>
         </w:tc>
@@ -1994,19 +1928,19 @@
               <w:jc w:val="left"/>
             </w:pPr>
             <w:r>
-              <w:t xml:space="preserve">MMR1-MMR2 drop-out rate</w:t>
-            </w:r>
-          </w:p>
-        </w:tc>
-        <w:tc>
-          <w:tcPr/>
-          <w:p>
-            <w:pPr>
-              <w:pStyle w:val="Compact"/>
-              <w:jc w:val="right"/>
-            </w:pPr>
-            <w:r>
-              <w:t xml:space="preserve">Yes</w:t>
+              <w:t xml:space="preserve">Tasa deserción SRP1 - SRP2</w:t>
+            </w:r>
+          </w:p>
+        </w:tc>
+        <w:tc>
+          <w:tcPr/>
+          <w:p>
+            <w:pPr>
+              <w:pStyle w:val="Compact"/>
+              <w:jc w:val="right"/>
+            </w:pPr>
+            <w:r>
+              <w:t xml:space="preserve">No</w:t>
             </w:r>
           </w:p>
         </w:tc>
@@ -2032,19 +1966,19 @@
               <w:jc w:val="left"/>
             </w:pPr>
             <w:r>
-              <w:t xml:space="preserve">Penta1–MMR1 drop-out rate</w:t>
-            </w:r>
-          </w:p>
-        </w:tc>
-        <w:tc>
-          <w:tcPr/>
-          <w:p>
-            <w:pPr>
-              <w:pStyle w:val="Compact"/>
-              <w:jc w:val="right"/>
-            </w:pPr>
-            <w:r>
-              <w:t xml:space="preserve">Yes</w:t>
+              <w:t xml:space="preserve">Tasa deserción Penta1 - SRP1</w:t>
+            </w:r>
+          </w:p>
+        </w:tc>
+        <w:tc>
+          <w:tcPr/>
+          <w:p>
+            <w:pPr>
+              <w:pStyle w:val="Compact"/>
+              <w:jc w:val="right"/>
+            </w:pPr>
+            <w:r>
+              <w:t xml:space="preserve">No</w:t>
             </w:r>
           </w:p>
         </w:tc>
@@ -2062,20 +1996,20 @@
         </w:tc>
       </w:tr>
     </w:tbl>
-    <w:bookmarkEnd w:id="43"/>
-    <w:bookmarkStart w:id="45" w:name="missing-identifier-data.-1"/>
+    <w:bookmarkEnd w:id="32"/>
+    <w:bookmarkStart w:id="34" w:name="datos-identificadores-faltantes.-1"/>
     <w:p>
       <w:pPr>
         <w:pStyle w:val="Heading4"/>
       </w:pPr>
       <w:r>
-        <w:t xml:space="preserve">Missing identifier data</w:t>
+        <w:t xml:space="preserve">Datos identificadores faltantes</w:t>
       </w:r>
       <w:r>
         <w:rPr>
           <w:rStyle w:val="FootnoteReference"/>
         </w:rPr>
-        <w:footnoteReference w:id="44"/>
+        <w:footnoteReference w:id="33"/>
       </w:r>
       <w:r>
         <w:t xml:space="preserve">.</w:t>
@@ -2102,7 +2036,7 @@
               <w:jc w:val="left"/>
             </w:pPr>
             <w:r>
-              <w:t xml:space="preserve">No missing data found</w:t>
+              <w:t xml:space="preserve">No se encontraron datos faltantes</w:t>
             </w:r>
           </w:p>
         </w:tc>
@@ -2118,14 +2052,14 @@
         </w:tc>
       </w:tr>
     </w:tbl>
-    <w:bookmarkEnd w:id="45"/>
-    <w:bookmarkStart w:id="46" w:name="data-with-invalid-geocodes.-2"/>
+    <w:bookmarkEnd w:id="34"/>
+    <w:bookmarkStart w:id="35" w:name="datos-con-geocódigos-inválidos.-2"/>
     <w:p>
       <w:pPr>
         <w:pStyle w:val="Heading4"/>
       </w:pPr>
       <w:r>
-        <w:t xml:space="preserve">Data with invalid geocodes.</w:t>
+        <w:t xml:space="preserve">Datos con geocódigos inválidos.</w:t>
       </w:r>
     </w:p>
     <w:tbl>
@@ -2149,7 +2083,7 @@
               <w:jc w:val="left"/>
             </w:pPr>
             <w:r>
-              <w:t xml:space="preserve">No invalid geocodes found</w:t>
+              <w:t xml:space="preserve">No se encontraron geocódigos inválidos</w:t>
             </w:r>
           </w:p>
         </w:tc>
@@ -2165,14 +2099,14 @@
         </w:tc>
       </w:tr>
     </w:tbl>
-    <w:bookmarkEnd w:id="46"/>
-    <w:bookmarkStart w:id="47" w:name="Xea08dc02d72a7e89a3f4c1866f58804a7bf8b38"/>
+    <w:bookmarkEnd w:id="35"/>
+    <w:bookmarkStart w:id="36" w:name="Xa1e6b2de5ab4fee5a5d04ef4b85bdc0cff9846f"/>
     <w:p>
       <w:pPr>
         <w:pStyle w:val="Heading4"/>
       </w:pPr>
       <w:r>
-        <w:t xml:space="preserve">Non-numeric or missing data on number of doses and drop-out rate.</w:t>
+        <w:t xml:space="preserve">Existen datos no numéricos o faltantes en número de dosis y tasa de deserción.</w:t>
       </w:r>
     </w:p>
     <w:tbl>
@@ -2196,7 +2130,7 @@
               <w:jc w:val="left"/>
             </w:pPr>
             <w:r>
-              <w:t xml:space="preserve">No non-numeric or missing data found</w:t>
+              <w:t xml:space="preserve">No se encontraron datos no numéricos o faltantes</w:t>
             </w:r>
           </w:p>
         </w:tc>
@@ -2217,24 +2151,24 @@
         <w:br w:type="page"/>
       </w:r>
     </w:p>
-    <w:bookmarkEnd w:id="47"/>
-    <w:bookmarkEnd w:id="48"/>
-    <w:bookmarkStart w:id="53" w:name="vulnerable-groups"/>
+    <w:bookmarkEnd w:id="36"/>
+    <w:bookmarkEnd w:id="37"/>
+    <w:bookmarkStart w:id="42" w:name="grupos-vulnerables"/>
     <w:p>
       <w:pPr>
         <w:pStyle w:val="Heading3"/>
       </w:pPr>
       <w:r>
-        <w:t xml:space="preserve">5. Vulnerable groups</w:t>
-      </w:r>
-    </w:p>
-    <w:bookmarkStart w:id="49" w:name="missing-data-by-variable.-3"/>
+        <w:t xml:space="preserve">5. Grupos vulnerables</w:t>
+      </w:r>
+    </w:p>
+    <w:bookmarkStart w:id="38" w:name="datos-faltantes-por-variable.-3"/>
     <w:p>
       <w:pPr>
         <w:pStyle w:val="Heading4"/>
       </w:pPr>
       <w:r>
-        <w:t xml:space="preserve">Missing data by variable.</w:t>
+        <w:t xml:space="preserve">Datos faltantes por variable.</w:t>
       </w:r>
     </w:p>
     <w:tbl>
@@ -2245,9 +2179,9 @@
         <w:tblLook w:firstRow="1" w:lastRow="0" w:firstColumn="0" w:lastColumn="0" w:noHBand="0" w:noVBand="0" w:val="0020"/>
       </w:tblPr>
       <w:tblGrid>
-        <w:gridCol w:w="7188"/>
-        <w:gridCol w:w="559"/>
-        <w:gridCol w:w="172"/>
+        <w:gridCol w:w="7072"/>
+        <w:gridCol w:w="677"/>
+        <w:gridCol w:w="169"/>
       </w:tblGrid>
       <w:tr>
         <w:trPr>
@@ -2273,7 +2207,7 @@
               <w:jc w:val="right"/>
             </w:pPr>
             <w:r>
-              <w:t xml:space="preserve">Missing data</w:t>
+              <w:t xml:space="preserve">Datos faltantes</w:t>
             </w:r>
           </w:p>
         </w:tc>
@@ -2311,7 +2245,7 @@
               <w:jc w:val="right"/>
             </w:pPr>
             <w:r>
-              <w:t xml:space="preserve">Yes</w:t>
+              <w:t xml:space="preserve">No</w:t>
             </w:r>
           </w:p>
         </w:tc>
@@ -2349,7 +2283,7 @@
               <w:jc w:val="right"/>
             </w:pPr>
             <w:r>
-              <w:t xml:space="preserve">Yes</w:t>
+              <w:t xml:space="preserve">No</w:t>
             </w:r>
           </w:p>
         </w:tc>
@@ -2387,7 +2321,7 @@
               <w:jc w:val="right"/>
             </w:pPr>
             <w:r>
-              <w:t xml:space="preserve">Yes</w:t>
+              <w:t xml:space="preserve">No</w:t>
             </w:r>
           </w:p>
         </w:tc>
@@ -2425,7 +2359,7 @@
               <w:jc w:val="right"/>
             </w:pPr>
             <w:r>
-              <w:t xml:space="preserve">Yes</w:t>
+              <w:t xml:space="preserve">No</w:t>
             </w:r>
           </w:p>
         </w:tc>
@@ -2463,7 +2397,7 @@
               <w:jc w:val="right"/>
             </w:pPr>
             <w:r>
-              <w:t xml:space="preserve">Yes</w:t>
+              <w:t xml:space="preserve">No</w:t>
             </w:r>
           </w:p>
         </w:tc>
@@ -2501,7 +2435,7 @@
               <w:jc w:val="right"/>
             </w:pPr>
             <w:r>
-              <w:t xml:space="preserve">Yes</w:t>
+              <w:t xml:space="preserve">No</w:t>
             </w:r>
           </w:p>
         </w:tc>
@@ -2539,7 +2473,7 @@
               <w:jc w:val="right"/>
             </w:pPr>
             <w:r>
-              <w:t xml:space="preserve">Yes</w:t>
+              <w:t xml:space="preserve">No</w:t>
             </w:r>
           </w:p>
         </w:tc>
@@ -2577,7 +2511,7 @@
               <w:jc w:val="right"/>
             </w:pPr>
             <w:r>
-              <w:t xml:space="preserve">Yes</w:t>
+              <w:t xml:space="preserve">No</w:t>
             </w:r>
           </w:p>
         </w:tc>
@@ -2615,7 +2549,7 @@
               <w:jc w:val="right"/>
             </w:pPr>
             <w:r>
-              <w:t xml:space="preserve">Yes</w:t>
+              <w:t xml:space="preserve">No</w:t>
             </w:r>
           </w:p>
         </w:tc>
@@ -2653,7 +2587,7 @@
               <w:jc w:val="right"/>
             </w:pPr>
             <w:r>
-              <w:t xml:space="preserve">Yes</w:t>
+              <w:t xml:space="preserve">No</w:t>
             </w:r>
           </w:p>
         </w:tc>
@@ -2691,7 +2625,7 @@
               <w:jc w:val="right"/>
             </w:pPr>
             <w:r>
-              <w:t xml:space="preserve">Yes</w:t>
+              <w:t xml:space="preserve">No</w:t>
             </w:r>
           </w:p>
         </w:tc>
@@ -2729,7 +2663,7 @@
               <w:jc w:val="right"/>
             </w:pPr>
             <w:r>
-              <w:t xml:space="preserve">Yes</w:t>
+              <w:t xml:space="preserve">No</w:t>
             </w:r>
           </w:p>
         </w:tc>
@@ -2747,20 +2681,20 @@
         </w:tc>
       </w:tr>
     </w:tbl>
-    <w:bookmarkEnd w:id="49"/>
-    <w:bookmarkStart w:id="51" w:name="missing-identifier-data.-2"/>
+    <w:bookmarkEnd w:id="38"/>
+    <w:bookmarkStart w:id="40" w:name="datos-identificadores-faltantes.-2"/>
     <w:p>
       <w:pPr>
         <w:pStyle w:val="Heading4"/>
       </w:pPr>
       <w:r>
-        <w:t xml:space="preserve">Missing identifier data</w:t>
+        <w:t xml:space="preserve">Datos identificadores faltantes</w:t>
       </w:r>
       <w:r>
         <w:rPr>
           <w:rStyle w:val="FootnoteReference"/>
         </w:rPr>
-        <w:footnoteReference w:id="50"/>
+        <w:footnoteReference w:id="39"/>
       </w:r>
       <w:r>
         <w:t xml:space="preserve">.</w:t>
@@ -2787,7 +2721,7 @@
               <w:jc w:val="left"/>
             </w:pPr>
             <w:r>
-              <w:t xml:space="preserve">No missing data found</w:t>
+              <w:t xml:space="preserve">No se encontraron datos faltantes</w:t>
             </w:r>
           </w:p>
         </w:tc>
@@ -2803,14 +2737,14 @@
         </w:tc>
       </w:tr>
     </w:tbl>
-    <w:bookmarkEnd w:id="51"/>
-    <w:bookmarkStart w:id="52" w:name="data-with-invalid-geocodes.-3"/>
+    <w:bookmarkEnd w:id="40"/>
+    <w:bookmarkStart w:id="41" w:name="datos-con-geocódigos-inválidos.-3"/>
     <w:p>
       <w:pPr>
         <w:pStyle w:val="Heading4"/>
       </w:pPr>
       <w:r>
-        <w:t xml:space="preserve">Data with invalid geocodes.</w:t>
+        <w:t xml:space="preserve">Datos con geocódigos inválidos.</w:t>
       </w:r>
     </w:p>
     <w:tbl>
@@ -2834,7 +2768,7 @@
               <w:jc w:val="left"/>
             </w:pPr>
             <w:r>
-              <w:t xml:space="preserve">No invalid geocodes found</w:t>
+              <w:t xml:space="preserve">No se encontraron geocódigos inválidos</w:t>
             </w:r>
           </w:p>
         </w:tc>
@@ -2855,24 +2789,24 @@
         <w:br w:type="page"/>
       </w:r>
     </w:p>
-    <w:bookmarkEnd w:id="52"/>
-    <w:bookmarkEnd w:id="53"/>
-    <w:bookmarkStart w:id="61" w:name="case-by-case-data"/>
+    <w:bookmarkEnd w:id="41"/>
+    <w:bookmarkEnd w:id="42"/>
+    <w:bookmarkStart w:id="50" w:name="datos-caso-a-caso"/>
     <w:p>
       <w:pPr>
         <w:pStyle w:val="Heading3"/>
       </w:pPr>
       <w:r>
-        <w:t xml:space="preserve">6. Case-by-case data</w:t>
-      </w:r>
-    </w:p>
-    <w:bookmarkStart w:id="54" w:name="missing-data-by-variable.-4"/>
+        <w:t xml:space="preserve">6. Datos caso a caso</w:t>
+      </w:r>
+    </w:p>
+    <w:bookmarkStart w:id="43" w:name="datos-faltantes-por-variable.-4"/>
     <w:p>
       <w:pPr>
         <w:pStyle w:val="Heading4"/>
       </w:pPr>
       <w:r>
-        <w:t xml:space="preserve">Missing data by variable.</w:t>
+        <w:t xml:space="preserve">Datos faltantes por variable.</w:t>
       </w:r>
     </w:p>
     <w:tbl>
@@ -2910,7 +2844,7 @@
               <w:jc w:val="right"/>
             </w:pPr>
             <w:r>
-              <w:t xml:space="preserve">Missing data</w:t>
+              <w:t xml:space="preserve">Datos faltantes</w:t>
             </w:r>
           </w:p>
         </w:tc>
@@ -2948,7 +2882,7 @@
               <w:jc w:val="right"/>
             </w:pPr>
             <w:r>
-              <w:t xml:space="preserve">Yes</w:t>
+              <w:t xml:space="preserve">No</w:t>
             </w:r>
           </w:p>
         </w:tc>
@@ -2986,7 +2920,7 @@
               <w:jc w:val="right"/>
             </w:pPr>
             <w:r>
-              <w:t xml:space="preserve">Yes</w:t>
+              <w:t xml:space="preserve">No</w:t>
             </w:r>
           </w:p>
         </w:tc>
@@ -3024,7 +2958,7 @@
               <w:jc w:val="right"/>
             </w:pPr>
             <w:r>
-              <w:t xml:space="preserve">Yes</w:t>
+              <w:t xml:space="preserve">No</w:t>
             </w:r>
           </w:p>
         </w:tc>
@@ -3062,7 +2996,7 @@
               <w:jc w:val="right"/>
             </w:pPr>
             <w:r>
-              <w:t xml:space="preserve">Yes</w:t>
+              <w:t xml:space="preserve">No</w:t>
             </w:r>
           </w:p>
         </w:tc>
@@ -3100,7 +3034,7 @@
               <w:jc w:val="right"/>
             </w:pPr>
             <w:r>
-              <w:t xml:space="preserve">Yes</w:t>
+              <w:t xml:space="preserve">No</w:t>
             </w:r>
           </w:p>
         </w:tc>
@@ -3138,7 +3072,7 @@
               <w:jc w:val="right"/>
             </w:pPr>
             <w:r>
-              <w:t xml:space="preserve">Yes</w:t>
+              <w:t xml:space="preserve">No</w:t>
             </w:r>
           </w:p>
         </w:tc>
@@ -3176,7 +3110,7 @@
               <w:jc w:val="right"/>
             </w:pPr>
             <w:r>
-              <w:t xml:space="preserve">Yes</w:t>
+              <w:t xml:space="preserve">No</w:t>
             </w:r>
           </w:p>
         </w:tc>
@@ -3214,7 +3148,7 @@
               <w:jc w:val="right"/>
             </w:pPr>
             <w:r>
-              <w:t xml:space="preserve">Yes</w:t>
+              <w:t xml:space="preserve">No</w:t>
             </w:r>
           </w:p>
         </w:tc>
@@ -3252,7 +3186,7 @@
               <w:jc w:val="right"/>
             </w:pPr>
             <w:r>
-              <w:t xml:space="preserve">Yes</w:t>
+              <w:t xml:space="preserve">No</w:t>
             </w:r>
           </w:p>
         </w:tc>
@@ -3290,7 +3224,7 @@
               <w:jc w:val="right"/>
             </w:pPr>
             <w:r>
-              <w:t xml:space="preserve">Yes</w:t>
+              <w:t xml:space="preserve">No</w:t>
             </w:r>
           </w:p>
         </w:tc>
@@ -3328,7 +3262,7 @@
               <w:jc w:val="right"/>
             </w:pPr>
             <w:r>
-              <w:t xml:space="preserve">Yes</w:t>
+              <w:t xml:space="preserve">No</w:t>
             </w:r>
           </w:p>
         </w:tc>
@@ -3366,7 +3300,7 @@
               <w:jc w:val="right"/>
             </w:pPr>
             <w:r>
-              <w:t xml:space="preserve">Yes</w:t>
+              <w:t xml:space="preserve">No</w:t>
             </w:r>
           </w:p>
         </w:tc>
@@ -3404,7 +3338,7 @@
               <w:jc w:val="right"/>
             </w:pPr>
             <w:r>
-              <w:t xml:space="preserve">Yes</w:t>
+              <w:t xml:space="preserve">No</w:t>
             </w:r>
           </w:p>
         </w:tc>
@@ -3442,7 +3376,7 @@
               <w:jc w:val="right"/>
             </w:pPr>
             <w:r>
-              <w:t xml:space="preserve">Yes</w:t>
+              <w:t xml:space="preserve">No</w:t>
             </w:r>
           </w:p>
         </w:tc>
@@ -3480,7 +3414,7 @@
               <w:jc w:val="right"/>
             </w:pPr>
             <w:r>
-              <w:t xml:space="preserve">Yes</w:t>
+              <w:t xml:space="preserve">No</w:t>
             </w:r>
           </w:p>
         </w:tc>
@@ -3518,7 +3452,7 @@
               <w:jc w:val="right"/>
             </w:pPr>
             <w:r>
-              <w:t xml:space="preserve">Yes</w:t>
+              <w:t xml:space="preserve">No</w:t>
             </w:r>
           </w:p>
         </w:tc>
@@ -3556,7 +3490,7 @@
               <w:jc w:val="right"/>
             </w:pPr>
             <w:r>
-              <w:t xml:space="preserve">Yes</w:t>
+              <w:t xml:space="preserve">No</w:t>
             </w:r>
           </w:p>
         </w:tc>
@@ -3594,7 +3528,7 @@
               <w:jc w:val="right"/>
             </w:pPr>
             <w:r>
-              <w:t xml:space="preserve">Yes</w:t>
+              <w:t xml:space="preserve">No</w:t>
             </w:r>
           </w:p>
         </w:tc>
@@ -3612,14 +3546,14 @@
         </w:tc>
       </w:tr>
     </w:tbl>
-    <w:bookmarkEnd w:id="54"/>
-    <w:bookmarkStart w:id="55" w:name="data-validity-of-date-variables."/>
+    <w:bookmarkEnd w:id="43"/>
+    <w:bookmarkStart w:id="44" w:name="X302d4c26e4b11d3e363f9b8abd8b47e632dc0aa"/>
     <w:p>
       <w:pPr>
         <w:pStyle w:val="Heading4"/>
       </w:pPr>
       <w:r>
-        <w:t xml:space="preserve">Data validity of date variables.</w:t>
+        <w:t xml:space="preserve">Validez de datos en variables tipo fecha.</w:t>
       </w:r>
     </w:p>
     <w:tbl>
@@ -3656,7 +3590,7 @@
               <w:jc w:val="right"/>
             </w:pPr>
             <w:r>
-              <w:t xml:space="preserve">Has invalid data</w:t>
+              <w:t xml:space="preserve">Tiene datos inválidos</w:t>
             </w:r>
           </w:p>
         </w:tc>
@@ -3682,7 +3616,7 @@
               <w:jc w:val="right"/>
             </w:pPr>
             <w:r>
-              <w:t xml:space="preserve">Yes</w:t>
+              <w:t xml:space="preserve">No</w:t>
             </w:r>
           </w:p>
         </w:tc>
@@ -3708,7 +3642,7 @@
               <w:jc w:val="right"/>
             </w:pPr>
             <w:r>
-              <w:t xml:space="preserve">Yes</w:t>
+              <w:t xml:space="preserve">No</w:t>
             </w:r>
           </w:p>
         </w:tc>
@@ -3734,7 +3668,7 @@
               <w:jc w:val="right"/>
             </w:pPr>
             <w:r>
-              <w:t xml:space="preserve">Yes</w:t>
+              <w:t xml:space="preserve">No</w:t>
             </w:r>
           </w:p>
         </w:tc>
@@ -3760,7 +3694,7 @@
               <w:jc w:val="right"/>
             </w:pPr>
             <w:r>
-              <w:t xml:space="preserve">Yes</w:t>
+              <w:t xml:space="preserve">No</w:t>
             </w:r>
           </w:p>
         </w:tc>
@@ -3786,7 +3720,7 @@
               <w:jc w:val="right"/>
             </w:pPr>
             <w:r>
-              <w:t xml:space="preserve">Yes</w:t>
+              <w:t xml:space="preserve">No</w:t>
             </w:r>
           </w:p>
         </w:tc>
@@ -3812,7 +3746,7 @@
               <w:jc w:val="right"/>
             </w:pPr>
             <w:r>
-              <w:t xml:space="preserve">Yes</w:t>
+              <w:t xml:space="preserve">No</w:t>
             </w:r>
           </w:p>
         </w:tc>
@@ -3838,26 +3772,26 @@
               <w:jc w:val="right"/>
             </w:pPr>
             <w:r>
-              <w:t xml:space="preserve">Yes</w:t>
+              <w:t xml:space="preserve">No</w:t>
             </w:r>
           </w:p>
         </w:tc>
       </w:tr>
     </w:tbl>
-    <w:bookmarkEnd w:id="55"/>
-    <w:bookmarkStart w:id="57" w:name="invalid-date-in-date-variables."/>
+    <w:bookmarkEnd w:id="44"/>
+    <w:bookmarkStart w:id="46" w:name="X43d45aac3cc729a6859d4c79dddade80e7a66f9"/>
     <w:p>
       <w:pPr>
         <w:pStyle w:val="Heading4"/>
       </w:pPr>
       <w:r>
-        <w:t xml:space="preserve">Invalid date in date variables</w:t>
+        <w:t xml:space="preserve">Datos con fecha inválida en variables tipo fecha</w:t>
       </w:r>
       <w:r>
         <w:rPr>
           <w:rStyle w:val="FootnoteReference"/>
         </w:rPr>
-        <w:footnoteReference w:id="56"/>
+        <w:footnoteReference w:id="45"/>
       </w:r>
       <w:r>
         <w:t xml:space="preserve">.</w:t>
@@ -3884,7 +3818,7 @@
               <w:jc w:val="left"/>
             </w:pPr>
             <w:r>
-              <w:t xml:space="preserve">No invalid data found</w:t>
+              <w:t xml:space="preserve">No se encontraron datos inválidos</w:t>
             </w:r>
           </w:p>
         </w:tc>
@@ -3900,14 +3834,14 @@
         </w:tc>
       </w:tr>
     </w:tbl>
-    <w:bookmarkEnd w:id="57"/>
-    <w:bookmarkStart w:id="58" w:name="X49a79da54881f2323c5f0a0ac04bca43d84642b"/>
+    <w:bookmarkEnd w:id="46"/>
+    <w:bookmarkStart w:id="47" w:name="X6d67e09fe1e78411109f4bf20974357629307f3"/>
     <w:p>
       <w:pPr>
         <w:pStyle w:val="Heading4"/>
       </w:pPr>
       <w:r>
-        <w:t xml:space="preserve">Cases where date of birth is later than date of onset of rash:</w:t>
+        <w:t xml:space="preserve">Casos donde la fecha de nacimiento es posterior a la fecha de inicio de exantema:</w:t>
       </w:r>
     </w:p>
     <w:tbl>
@@ -3931,7 +3865,7 @@
               <w:jc w:val="left"/>
             </w:pPr>
             <w:r>
-              <w:t xml:space="preserve">No cases found</w:t>
+              <w:t xml:space="preserve">No se encontraron casos</w:t>
             </w:r>
           </w:p>
         </w:tc>
@@ -3947,14 +3881,14 @@
         </w:tc>
       </w:tr>
     </w:tbl>
-    <w:bookmarkEnd w:id="58"/>
-    <w:bookmarkStart w:id="59" w:name="Xe31c06d1c184d5bfd3c9c628d9ef040b877f69e"/>
+    <w:bookmarkEnd w:id="47"/>
+    <w:bookmarkStart w:id="48" w:name="X7c822fded6e4daf643109c6d2d670cacc21e23f"/>
     <w:p>
       <w:pPr>
         <w:pStyle w:val="Heading4"/>
       </w:pPr>
       <w:r>
-        <w:t xml:space="preserve">Cases where date of onset of rash is later than date of sample collection:</w:t>
+        <w:t xml:space="preserve">Casos donde la fecha de inicio de exantema es posterior a la fecha de obtención de muestra:</w:t>
       </w:r>
     </w:p>
     <w:tbl>
@@ -3978,7 +3912,7 @@
               <w:jc w:val="left"/>
             </w:pPr>
             <w:r>
-              <w:t xml:space="preserve">No cases found</w:t>
+              <w:t xml:space="preserve">No se encontraron casos</w:t>
             </w:r>
           </w:p>
         </w:tc>
@@ -3994,14 +3928,14 @@
         </w:tc>
       </w:tr>
     </w:tbl>
-    <w:bookmarkEnd w:id="59"/>
-    <w:bookmarkStart w:id="60" w:name="Xebcd7aaa7aa7b971fffce4624699e743d3d9a42"/>
+    <w:bookmarkEnd w:id="48"/>
+    <w:bookmarkStart w:id="49" w:name="X53120599f87b830009528368fc3a792fe5361d9"/>
     <w:p>
       <w:pPr>
         <w:pStyle w:val="Heading4"/>
       </w:pPr>
       <w:r>
-        <w:t xml:space="preserve">Cases with errors in vaccination history or number of doses:</w:t>
+        <w:t xml:space="preserve">Casos con errores en antecedente de vacunación y número de dosis:</w:t>
       </w:r>
     </w:p>
     <w:tbl>
@@ -4025,7 +3959,7 @@
               <w:jc w:val="left"/>
             </w:pPr>
             <w:r>
-              <w:t xml:space="preserve">No cases found</w:t>
+              <w:t xml:space="preserve">No se encontraron casos</w:t>
             </w:r>
           </w:p>
         </w:tc>
@@ -4046,24 +3980,24 @@
         <w:br w:type="page"/>
       </w:r>
     </w:p>
-    <w:bookmarkEnd w:id="60"/>
-    <w:bookmarkEnd w:id="61"/>
-    <w:bookmarkStart w:id="68" w:name="rapid-response"/>
+    <w:bookmarkEnd w:id="49"/>
+    <w:bookmarkEnd w:id="50"/>
+    <w:bookmarkStart w:id="57" w:name="respuesta-rápida"/>
     <w:p>
       <w:pPr>
         <w:pStyle w:val="Heading3"/>
       </w:pPr>
       <w:r>
-        <w:t xml:space="preserve">7. Rapid response</w:t>
-      </w:r>
-    </w:p>
-    <w:bookmarkStart w:id="62" w:name="missing-data-by-variable.-5"/>
+        <w:t xml:space="preserve">7. Respuesta rápida</w:t>
+      </w:r>
+    </w:p>
+    <w:bookmarkStart w:id="51" w:name="datos-faltantes-por-variable.-5"/>
     <w:p>
       <w:pPr>
         <w:pStyle w:val="Heading4"/>
       </w:pPr>
       <w:r>
-        <w:t xml:space="preserve">Missing data by variable.</w:t>
+        <w:t xml:space="preserve">Datos faltantes por variable.</w:t>
       </w:r>
     </w:p>
     <w:tbl>
@@ -4074,9 +4008,9 @@
         <w:tblLook w:firstRow="1" w:lastRow="0" w:firstColumn="0" w:lastColumn="0" w:noHBand="0" w:noVBand="0" w:val="0020"/>
       </w:tblPr>
       <w:tblGrid>
-        <w:gridCol w:w="6707"/>
-        <w:gridCol w:w="927"/>
-        <w:gridCol w:w="285"/>
+        <w:gridCol w:w="6530"/>
+        <w:gridCol w:w="1111"/>
+        <w:gridCol w:w="277"/>
       </w:tblGrid>
       <w:tr>
         <w:trPr>
@@ -4102,7 +4036,7 @@
               <w:jc w:val="right"/>
             </w:pPr>
             <w:r>
-              <w:t xml:space="preserve">Missing data</w:t>
+              <w:t xml:space="preserve">Datos faltantes</w:t>
             </w:r>
           </w:p>
         </w:tc>
@@ -4140,7 +4074,7 @@
               <w:jc w:val="right"/>
             </w:pPr>
             <w:r>
-              <w:t xml:space="preserve">Yes</w:t>
+              <w:t xml:space="preserve">No</w:t>
             </w:r>
           </w:p>
         </w:tc>
@@ -4178,7 +4112,7 @@
               <w:jc w:val="right"/>
             </w:pPr>
             <w:r>
-              <w:t xml:space="preserve">Yes</w:t>
+              <w:t xml:space="preserve">No</w:t>
             </w:r>
           </w:p>
         </w:tc>
@@ -4216,7 +4150,7 @@
               <w:jc w:val="right"/>
             </w:pPr>
             <w:r>
-              <w:t xml:space="preserve">Yes</w:t>
+              <w:t xml:space="preserve">No</w:t>
             </w:r>
           </w:p>
         </w:tc>
@@ -4254,7 +4188,7 @@
               <w:jc w:val="right"/>
             </w:pPr>
             <w:r>
-              <w:t xml:space="preserve">Yes</w:t>
+              <w:t xml:space="preserve">No</w:t>
             </w:r>
           </w:p>
         </w:tc>
@@ -4292,7 +4226,7 @@
               <w:jc w:val="right"/>
             </w:pPr>
             <w:r>
-              <w:t xml:space="preserve">Yes</w:t>
+              <w:t xml:space="preserve">Si</w:t>
             </w:r>
           </w:p>
         </w:tc>
@@ -4330,7 +4264,7 @@
               <w:jc w:val="right"/>
             </w:pPr>
             <w:r>
-              <w:t xml:space="preserve">Yes</w:t>
+              <w:t xml:space="preserve">Si</w:t>
             </w:r>
           </w:p>
         </w:tc>
@@ -4348,20 +4282,20 @@
         </w:tc>
       </w:tr>
     </w:tbl>
-    <w:bookmarkEnd w:id="62"/>
-    <w:bookmarkStart w:id="64" w:name="rows-with-missing-data.-2"/>
+    <w:bookmarkEnd w:id="51"/>
+    <w:bookmarkStart w:id="53" w:name="filas-con-datos-faltantes.-2"/>
     <w:p>
       <w:pPr>
         <w:pStyle w:val="Heading4"/>
       </w:pPr>
       <w:r>
-        <w:t xml:space="preserve">Rows with missing data</w:t>
+        <w:t xml:space="preserve">Filas con datos faltantes</w:t>
       </w:r>
       <w:r>
         <w:rPr>
           <w:rStyle w:val="FootnoteReference"/>
         </w:rPr>
-        <w:footnoteReference w:id="63"/>
+        <w:footnoteReference w:id="52"/>
       </w:r>
       <w:r>
         <w:t xml:space="preserve">.</w:t>
@@ -4375,13 +4309,13 @@
         <w:tblLook w:firstRow="1" w:lastRow="0" w:firstColumn="0" w:lastColumn="0" w:noHBand="0" w:noVBand="0" w:val="0020"/>
       </w:tblPr>
       <w:tblGrid>
-        <w:gridCol w:w="132"/>
-        <w:gridCol w:w="561"/>
-        <w:gridCol w:w="561"/>
-        <w:gridCol w:w="594"/>
-        <w:gridCol w:w="396"/>
-        <w:gridCol w:w="3102"/>
-        <w:gridCol w:w="2574"/>
+        <w:gridCol w:w="164"/>
+        <w:gridCol w:w="558"/>
+        <w:gridCol w:w="558"/>
+        <w:gridCol w:w="591"/>
+        <w:gridCol w:w="394"/>
+        <w:gridCol w:w="3089"/>
+        <w:gridCol w:w="2563"/>
       </w:tblGrid>
       <w:tr>
         <w:trPr>
@@ -4395,7 +4329,7 @@
               <w:jc w:val="right"/>
             </w:pPr>
             <w:r>
-              <w:t xml:space="preserve">ROW</w:t>
+              <w:t xml:space="preserve">FILA</w:t>
             </w:r>
           </w:p>
         </w:tc>
@@ -4645,14 +4579,14 @@
         </w:tc>
       </w:tr>
     </w:tbl>
-    <w:bookmarkEnd w:id="64"/>
-    <w:bookmarkStart w:id="65" w:name="data-with-invalid-geocodes.-4"/>
+    <w:bookmarkEnd w:id="53"/>
+    <w:bookmarkStart w:id="54" w:name="datos-con-geocódigos-inválidos.-4"/>
     <w:p>
       <w:pPr>
         <w:pStyle w:val="Heading4"/>
       </w:pPr>
       <w:r>
-        <w:t xml:space="preserve">Data with invalid geocodes.</w:t>
+        <w:t xml:space="preserve">Datos con geocódigos inválidos.</w:t>
       </w:r>
     </w:p>
     <w:tbl>
@@ -4676,7 +4610,7 @@
               <w:jc w:val="left"/>
             </w:pPr>
             <w:r>
-              <w:t xml:space="preserve">No invalid geocodes found</w:t>
+              <w:t xml:space="preserve">No se encontraron geocódigos inválidos</w:t>
             </w:r>
           </w:p>
         </w:tc>
@@ -4692,26 +4626,20 @@
         </w:tc>
       </w:tr>
     </w:tbl>
-    <w:bookmarkEnd w:id="65"/>
-    <w:bookmarkStart w:id="66" w:name="Xf494f6ea96a408eea9d76a6c2ea6482ba6d81f9"/>
+    <w:bookmarkEnd w:id="54"/>
+    <w:bookmarkStart w:id="55" w:name="Xfce11e58a732c4f30db932eef1b3a1adefb742b"/>
     <w:p>
       <w:pPr>
         <w:pStyle w:val="Heading4"/>
       </w:pPr>
       <w:r>
-        <w:t xml:space="preserve">Invalid data in</w:t>
+        <w:t xml:space="preserve">Datos inválidos en</w:t>
       </w:r>
       <w:r>
         <w:t xml:space="preserve"> </w:t>
       </w:r>
       <w:r>
-        <w:t xml:space="preserve">‘</w:t>
-      </w:r>
-      <w:r>
-        <w:t xml:space="preserve">Presencia de un equipo subnacional de respuesta rápida capacitado a nivel subnacional (Si/No)</w:t>
-      </w:r>
-      <w:r>
-        <w:t xml:space="preserve">’</w:t>
+        <w:t xml:space="preserve">‘Presencia de un equipo subnacional de respuesta rápida capacitado a nivel subnacional (Si/No)’</w:t>
       </w:r>
       <w:r>
         <w:t xml:space="preserve">.</w:t>
@@ -4725,10 +4653,10 @@
         <w:tblLook w:firstRow="1" w:lastRow="0" w:firstColumn="0" w:lastColumn="0" w:noHBand="0" w:noVBand="0" w:val="0020"/>
       </w:tblPr>
       <w:tblGrid>
-        <w:gridCol w:w="240"/>
-        <w:gridCol w:w="1020"/>
-        <w:gridCol w:w="1020"/>
-        <w:gridCol w:w="5640"/>
+        <w:gridCol w:w="297"/>
+        <w:gridCol w:w="1012"/>
+        <w:gridCol w:w="1012"/>
+        <w:gridCol w:w="5597"/>
       </w:tblGrid>
       <w:tr>
         <w:trPr>
@@ -4742,7 +4670,7 @@
               <w:jc w:val="right"/>
             </w:pPr>
             <w:r>
-              <w:t xml:space="preserve">ROW</w:t>
+              <w:t xml:space="preserve">FILA</w:t>
             </w:r>
           </w:p>
         </w:tc>
@@ -4834,26 +4762,20 @@
         </w:tc>
       </w:tr>
     </w:tbl>
-    <w:bookmarkEnd w:id="66"/>
-    <w:bookmarkStart w:id="67" w:name="X43e693b9fe33a4a67b4f2728d29a31f7dd2194b"/>
+    <w:bookmarkEnd w:id="55"/>
+    <w:bookmarkStart w:id="56" w:name="X5e4aee5a847ea6059bc00ab6273f705611bb7da"/>
     <w:p>
       <w:pPr>
         <w:pStyle w:val="Heading4"/>
       </w:pPr>
       <w:r>
-        <w:t xml:space="preserve">Non-numeric data in</w:t>
+        <w:t xml:space="preserve">Datos no numéricos en</w:t>
       </w:r>
       <w:r>
         <w:t xml:space="preserve"> </w:t>
       </w:r>
       <w:r>
-        <w:t xml:space="preserve">‘</w:t>
-      </w:r>
-      <w:r>
-        <w:t xml:space="preserve">El equipo subnacional de respuesta rápida fue entrenado en los últimos 2 años</w:t>
-      </w:r>
-      <w:r>
-        <w:t xml:space="preserve">’</w:t>
+        <w:t xml:space="preserve">‘El equipo subnacional de respuesta rápida fue entrenado en los últimos 2 años’</w:t>
       </w:r>
       <w:r>
         <w:t xml:space="preserve">.</w:t>
@@ -4867,10 +4789,10 @@
         <w:tblLook w:firstRow="1" w:lastRow="0" w:firstColumn="0" w:lastColumn="0" w:noHBand="0" w:noVBand="0" w:val="0020"/>
       </w:tblPr>
       <w:tblGrid>
-        <w:gridCol w:w="273"/>
-        <w:gridCol w:w="1160"/>
-        <w:gridCol w:w="1160"/>
-        <w:gridCol w:w="5325"/>
+        <w:gridCol w:w="338"/>
+        <w:gridCol w:w="1150"/>
+        <w:gridCol w:w="1150"/>
+        <w:gridCol w:w="5280"/>
       </w:tblGrid>
       <w:tr>
         <w:trPr>
@@ -4884,7 +4806,7 @@
               <w:jc w:val="right"/>
             </w:pPr>
             <w:r>
-              <w:t xml:space="preserve">ROW</w:t>
+              <w:t xml:space="preserve">FILA</w:t>
             </w:r>
           </w:p>
         </w:tc>
@@ -4981,25 +4903,25 @@
         <w:br w:type="page"/>
       </w:r>
     </w:p>
-    <w:bookmarkEnd w:id="67"/>
-    <w:bookmarkEnd w:id="68"/>
-    <w:bookmarkEnd w:id="69"/>
-    <w:bookmarkStart w:id="74" w:name="review-loading-of-country-flag"/>
+    <w:bookmarkEnd w:id="56"/>
+    <w:bookmarkEnd w:id="57"/>
+    <w:bookmarkEnd w:id="58"/>
+    <w:bookmarkStart w:id="63" w:name="revisión-de-carga-de-bandera-de-país"/>
     <w:p>
       <w:pPr>
         <w:pStyle w:val="Heading1"/>
       </w:pPr>
       <w:r>
-        <w:t xml:space="preserve">Review loading of country flag</w:t>
-      </w:r>
-    </w:p>
-    <w:bookmarkStart w:id="73" w:name="load-flag"/>
+        <w:t xml:space="preserve">Revisión de carga de bandera de país</w:t>
+      </w:r>
+    </w:p>
+    <w:bookmarkStart w:id="62" w:name="carga-de-la-bandera"/>
     <w:p>
       <w:pPr>
         <w:pStyle w:val="Heading3"/>
       </w:pPr>
       <w:r>
-        <w:t xml:space="preserve">Load flag</w:t>
+        <w:t xml:space="preserve">Carga de la bandera</w:t>
       </w:r>
     </w:p>
     <w:p>
@@ -5011,18 +4933,18 @@
           <wp:inline>
             <wp:extent cx="2667000" cy="1780222"/>
             <wp:effectExtent b="0" l="0" r="0" t="0"/>
-            <wp:docPr descr="" title="" id="71" name="Picture"/>
+            <wp:docPr descr="" title="" id="60" name="Picture"/>
             <a:graphic>
               <a:graphicData uri="http://schemas.openxmlformats.org/drawingml/2006/picture">
                 <pic:pic>
                   <pic:nvPicPr>
-                    <pic:cNvPr descr="../Data/country_flag.png" id="72" name="Picture"/>
+                    <pic:cNvPr descr="../Data/country_flag.png" id="61" name="Picture"/>
                     <pic:cNvPicPr>
                       <a:picLocks noChangeArrowheads="1" noChangeAspect="1"/>
                     </pic:cNvPicPr>
                   </pic:nvPicPr>
                   <pic:blipFill>
-                    <a:blip r:embed="rId70"/>
+                    <a:blip r:embed="rId59"/>
                     <a:stretch>
                       <a:fillRect/>
                     </a:stretch>
@@ -5054,30 +4976,25 @@
         <w:pStyle w:val="BodyText"/>
       </w:pPr>
       <w:r>
-        <w:t xml:space="preserve">Success: Image of flag has been found in</w:t>
+        <w:t xml:space="preserve">Exito: se ha encontrado la imagen de la bandera en la carpeta</w:t>
       </w:r>
       <w:r>
         <w:t xml:space="preserve"> </w:t>
       </w:r>
       <w:r>
-        <w:t xml:space="preserve">‘</w:t>
-      </w:r>
-      <w:r>
-        <w:t xml:space="preserve">Data</w:t>
-      </w:r>
-      <w:r>
-        <w:t xml:space="preserve">’</w:t>
-      </w:r>
-      <w:r>
-        <w:t xml:space="preserve"> </w:t>
-      </w:r>
-      <w:r>
-        <w:t xml:space="preserve">folder.</w:t>
-      </w:r>
-    </w:p>
-    <w:bookmarkEnd w:id="73"/>
-    <w:bookmarkEnd w:id="74"/>
-    <w:sectPr/>
+        <w:t xml:space="preserve">‘Data’</w:t>
+      </w:r>
+      <w:r>
+        <w:t xml:space="preserve">.</w:t>
+      </w:r>
+    </w:p>
+    <w:bookmarkEnd w:id="62"/>
+    <w:bookmarkEnd w:id="63"/>
+    <w:sectPr>
+      <w:footnotePr>
+        <w:numRestart w:val="eachSect"/>
+      </w:footnotePr>
+    </w:sectPr>
   </w:body>
 </w:document>
 </file>
@@ -5102,7 +5019,7 @@
       </w:r>
     </w:p>
   </w:footnote>
-  <w:footnote w:id="24">
+  <w:footnote w:id="13">
     <w:p>
       <w:pPr>
         <w:pStyle w:val="FootnoteText"/>
@@ -5117,11 +5034,11 @@
         <w:t xml:space="preserve"> </w:t>
       </w:r>
       <w:r>
-        <w:t xml:space="preserve">NA: missing data</w:t>
+        <w:t xml:space="preserve">NA: dato faltante</w:t>
       </w:r>
     </w:p>
   </w:footnote>
-  <w:footnote w:id="30">
+  <w:footnote w:id="19">
     <w:p>
       <w:pPr>
         <w:pStyle w:val="FootnoteText"/>
@@ -5136,11 +5053,11 @@
         <w:t xml:space="preserve"> </w:t>
       </w:r>
       <w:r>
-        <w:t xml:space="preserve">NA: missing data</w:t>
+        <w:t xml:space="preserve">NA: dato faltante</w:t>
       </w:r>
     </w:p>
   </w:footnote>
-  <w:footnote w:id="37">
+  <w:footnote w:id="26">
     <w:p>
       <w:pPr>
         <w:pStyle w:val="FootnoteText"/>
@@ -5155,11 +5072,11 @@
         <w:t xml:space="preserve"> </w:t>
       </w:r>
       <w:r>
-        <w:t xml:space="preserve">NA: missing data</w:t>
+        <w:t xml:space="preserve">NA: dato faltante</w:t>
       </w:r>
     </w:p>
   </w:footnote>
-  <w:footnote w:id="44">
+  <w:footnote w:id="33">
     <w:p>
       <w:pPr>
         <w:pStyle w:val="FootnoteText"/>
@@ -5174,11 +5091,11 @@
         <w:t xml:space="preserve"> </w:t>
       </w:r>
       <w:r>
-        <w:t xml:space="preserve">NA: missing data</w:t>
+        <w:t xml:space="preserve">NA: dato faltante</w:t>
       </w:r>
     </w:p>
   </w:footnote>
-  <w:footnote w:id="50">
+  <w:footnote w:id="39">
     <w:p>
       <w:pPr>
         <w:pStyle w:val="FootnoteText"/>
@@ -5193,11 +5110,11 @@
         <w:t xml:space="preserve"> </w:t>
       </w:r>
       <w:r>
-        <w:t xml:space="preserve">NA: missing data</w:t>
+        <w:t xml:space="preserve">NA: dato faltante</w:t>
       </w:r>
     </w:p>
   </w:footnote>
-  <w:footnote w:id="56">
+  <w:footnote w:id="45">
     <w:p>
       <w:pPr>
         <w:pStyle w:val="FootnoteText"/>
@@ -5212,11 +5129,11 @@
         <w:t xml:space="preserve"> </w:t>
       </w:r>
       <w:r>
-        <w:t xml:space="preserve">Invalid date: Any date not in DD/MM/YYYY format.</w:t>
+        <w:t xml:space="preserve">Fecha inválida: toda fecha que no cumpla con el formato de DD/MM/AAAA.</w:t>
       </w:r>
     </w:p>
   </w:footnote>
-  <w:footnote w:id="63">
+  <w:footnote w:id="52">
     <w:p>
       <w:pPr>
         <w:pStyle w:val="FootnoteText"/>
@@ -5231,7 +5148,7 @@
         <w:t xml:space="preserve"> </w:t>
       </w:r>
       <w:r>
-        <w:t xml:space="preserve">NA: missing data</w:t>
+        <w:t xml:space="preserve">NA: dato faltante</w:t>
       </w:r>
     </w:p>
   </w:footnote>
@@ -5454,10 +5371,10 @@
   <w:docDefaults>
     <w:rPrDefault>
       <w:rPr>
-        <w:rFonts w:asciiTheme="minorHAnsi" w:cstheme="minorBidi" w:eastAsiaTheme="minorHAnsi" w:hAnsiTheme="minorHAnsi"/>
+        <w:rFonts w:asciiTheme="minorHAnsi" w:cstheme="minorBidi" w:eastAsiaTheme="minorEastAsia" w:hAnsiTheme="minorHAnsi"/>
         <w:sz w:val="24"/>
         <w:szCs w:val="24"/>
-        <w:lang w:bidi="ar-SA" w:eastAsia="en-US" w:val="en-US"/>
+        <w:lang w:bidi="ar-SA" w:eastAsia="zh-CN" w:val="en-US"/>
       </w:rPr>
     </w:rPrDefault>
     <w:pPrDefault>
@@ -5509,8 +5426,6 @@
     </w:pPr>
     <w:rPr>
       <w:rFonts w:asciiTheme="majorHAnsi" w:cstheme="majorBidi" w:eastAsiaTheme="majorEastAsia" w:hAnsiTheme="majorHAnsi"/>
-      <w:spacing w:val="-10"/>
-      <w:kern w:val="28"/>
       <w:sz w:val="56"/>
       <w:szCs w:val="56"/>
     </w:rPr>
@@ -5523,15 +5438,13 @@
     <w:rsid w:val="00A10FD9"/>
     <w:rPr>
       <w:rFonts w:asciiTheme="majorHAnsi" w:cstheme="majorBidi" w:eastAsiaTheme="majorEastAsia" w:hAnsiTheme="majorHAnsi"/>
-      <w:spacing w:val="-10"/>
-      <w:kern w:val="28"/>
       <w:sz w:val="56"/>
       <w:szCs w:val="56"/>
     </w:rPr>
   </w:style>
   <w:style w:styleId="Subtitle" w:type="paragraph">
     <w:name w:val="Subtitle"/>
-    <w:basedOn w:val="Normal"/>
+    <w:basedOn w:val="Title"/>
     <w:next w:val="BodyText"/>
     <w:link w:val="SubtitleChar"/>
     <w:uiPriority w:val="11"/>
@@ -5544,7 +5457,6 @@
     </w:pPr>
     <w:rPr>
       <w:rFonts w:cstheme="majorBidi" w:eastAsiaTheme="majorEastAsia"/>
-      <w:color w:themeColor="text1" w:themeTint="A6" w:val="595959"/>
       <w:spacing w:val="15"/>
       <w:sz w:val="28"/>
       <w:szCs w:val="28"/>
@@ -5566,23 +5478,31 @@
   </w:style>
   <w:style w:customStyle="1" w:styleId="Author" w:type="paragraph">
     <w:name w:val="Author"/>
+    <w:basedOn w:val="Title"/>
     <w:next w:val="BodyText"/>
     <w:qFormat/>
     <w:pPr>
       <w:keepNext/>
       <w:keepLines/>
-      <w:jc w:val="center"/>
     </w:pPr>
+    <w:rPr>
+      <w:sz w:val="24"/>
+      <w:szCs w:val="24"/>
+    </w:rPr>
   </w:style>
   <w:style w:styleId="Date" w:type="paragraph">
     <w:name w:val="Date"/>
+    <w:basedOn w:val="Title"/>
     <w:next w:val="BodyText"/>
     <w:qFormat/>
     <w:pPr>
       <w:keepNext/>
       <w:keepLines/>
-      <w:jc w:val="center"/>
     </w:pPr>
+    <w:rPr>
+      <w:sz w:val="24"/>
+      <w:szCs w:val="24"/>
+    </w:rPr>
   </w:style>
   <w:style w:customStyle="1" w:styleId="AbstractTitle" w:type="paragraph">
     <w:name w:val="Abstract Title"/>
@@ -5597,7 +5517,6 @@
     </w:pPr>
     <w:rPr>
       <w:b/>
-      <w:color w:val="345A8A"/>
       <w:sz w:val="20"/>
       <w:szCs w:val="20"/>
     </w:rPr>
@@ -5996,13 +5915,6 @@
       </w:tblCellMar>
     </w:tblPr>
     <w:tblStylePr w:type="firstRow">
-      <w:tblPr>
-        <w:jc w:val="left"/>
-        <w:tblInd w:type="dxa" w:w="0"/>
-      </w:tblPr>
-      <w:trPr>
-        <w:jc w:val="left"/>
-      </w:trPr>
       <w:tcPr>
         <w:tcBorders>
           <w:bottom w:val="single"/>

</xml_diff>